<commit_message>
Sequence Diagrams and changes to the documentation
</commit_message>
<xml_diff>
--- a/TEAM31_Submission.docx
+++ b/TEAM31_Submission.docx
@@ -2270,6 +2270,120 @@
         </w:rPr>
         <w:t>Design Decisions:</w:t>
       </w:r>
+    </w:p>
+    <w:p>
+      <w:r>
+        <w:rPr>
+          <w:b/>
+          <w:bCs/>
+        </w:rPr>
+        <w:t>Observer design pattern usage:</w:t>
+      </w:r>
+    </w:p>
+    <w:p>
+      <w:r>
+        <w:t xml:space="preserve">In our design, we chose to use the observer design pattern for the </w:t>
+      </w:r>
+      <w:proofErr w:type="spellStart"/>
+      <w:r>
+        <w:t>RaDoTech</w:t>
+      </w:r>
+      <w:proofErr w:type="spellEnd"/>
+      <w:r>
+        <w:t xml:space="preserve"> app as it was the best fit for our needs. The observer is the main window with its subject being the app class. We have a one-to-many relationship between these two and it allows the app to notify the </w:t>
+      </w:r>
+      <w:proofErr w:type="spellStart"/>
+      <w:r>
+        <w:t>mainwindow</w:t>
+      </w:r>
+      <w:proofErr w:type="spellEnd"/>
+      <w:r>
+        <w:t xml:space="preserve"> so it can perform the correct UI changes as the scenario plays out. </w:t>
+      </w:r>
+    </w:p>
+    <w:p>
+      <w:r>
+        <w:t xml:space="preserve">We use the pull model, for example, when the user starts a </w:t>
+      </w:r>
+      <w:r>
+        <w:t>scan,</w:t>
+      </w:r>
+      <w:r>
+        <w:t xml:space="preserve"> it notifies the </w:t>
+      </w:r>
+      <w:proofErr w:type="spellStart"/>
+      <w:r>
+        <w:t>mainwindow</w:t>
+      </w:r>
+      <w:proofErr w:type="spellEnd"/>
+      <w:r>
+        <w:t xml:space="preserve"> and the mainwindow disables the navigation buttons and locks the user to the measuring screen. When the scan is done the app tells </w:t>
+      </w:r>
+      <w:proofErr w:type="spellStart"/>
+      <w:r>
+        <w:t>mainwindow</w:t>
+      </w:r>
+      <w:proofErr w:type="spellEnd"/>
+      <w:r>
+        <w:t xml:space="preserve"> to enable them, the reason for the pull model is that it is up to the </w:t>
+      </w:r>
+      <w:proofErr w:type="spellStart"/>
+      <w:r>
+        <w:t>mainwindow</w:t>
+      </w:r>
+      <w:proofErr w:type="spellEnd"/>
+      <w:r>
+        <w:t xml:space="preserve"> to get additional information such as the scan. The pull model is also important as it gives control to the app to tell the </w:t>
+      </w:r>
+      <w:proofErr w:type="spellStart"/>
+      <w:r>
+        <w:t>mainwindow</w:t>
+      </w:r>
+      <w:proofErr w:type="spellEnd"/>
+      <w:r>
+        <w:t xml:space="preserve"> what is going on so the </w:t>
+      </w:r>
+      <w:proofErr w:type="spellStart"/>
+      <w:r>
+        <w:t>mainwindow</w:t>
+      </w:r>
+      <w:proofErr w:type="spellEnd"/>
+      <w:r>
+        <w:t xml:space="preserve"> can react and update accordingly</w:t>
+      </w:r>
+    </w:p>
+    <w:p>
+      <w:r>
+        <w:t xml:space="preserve">Another use of the observer pattern is updating the graph during a scan, every time a data point is read the app emits a notification with the data point, the </w:t>
+      </w:r>
+      <w:proofErr w:type="spellStart"/>
+      <w:r>
+        <w:t>mainwindow</w:t>
+      </w:r>
+      <w:proofErr w:type="spellEnd"/>
+      <w:r>
+        <w:t xml:space="preserve"> then updates the graph with the new information. We also used the observer </w:t>
+      </w:r>
+      <w:r>
+        <w:lastRenderedPageBreak/>
+        <w:t>pattern for the battery. When the battery is fully depleted it notifies the device to turn off as well as the app in case the app is currently running a scan.</w:t>
+      </w:r>
+    </w:p>
+    <w:p>
+      <w:r>
+        <w:t>Overall,</w:t>
+      </w:r>
+      <w:r>
+        <w:t xml:space="preserve"> the observer pattern allows us to perform key steps in the creation of the app in QT to be able to illustrate it properly to the screen.</w:t>
+      </w:r>
+    </w:p>
+    <w:p>
+      <w:pPr>
+        <w:rPr>
+          <w:sz w:val="22"/>
+          <w:szCs w:val="22"/>
+        </w:rPr>
+      </w:pPr>
     </w:p>
     <w:p>
       <w:pPr>
@@ -2561,13 +2675,14 @@
       <w:r>
         <w:t xml:space="preserve">The data is not persistent, meaning that when you relaunch the app anything done previously is not saved. The user </w:t>
       </w:r>
-      <w:proofErr w:type="gramStart"/>
-      <w:r>
-        <w:t>is able to</w:t>
-      </w:r>
-      <w:proofErr w:type="gramEnd"/>
+      <w:r>
+        <w:t>can</w:t>
+      </w:r>
       <w:r>
         <w:t xml:space="preserve"> view any scans done previously during the simulation.</w:t>
+      </w:r>
+      <w:r>
+        <w:t xml:space="preserve"> The scans are saved in the most recent order and allows the user to see at what date they were taken. We chose to allow the user to have seamless connection between the different scans to quickly allow a user to see differences overtime. We added a most recent view of the last scan to the home screen for quick of ease.</w:t>
       </w:r>
     </w:p>
     <w:p/>
@@ -2645,6 +2760,9 @@
       <w:r>
         <w:t xml:space="preserve"> stops the most recent scan and cannot be turned on until you click the charge button that puts the battery back to 100%.</w:t>
       </w:r>
+      <w:r>
+        <w:t xml:space="preserve"> There are checks throughout the code where the system will give messages when the battery is out and stop any current actions. The device can easily be turned on and off and automatically turns off when it is out of battery.</w:t>
+      </w:r>
     </w:p>
     <w:p/>
     <w:p>
@@ -2743,10 +2861,7 @@
         <w:t xml:space="preserve"> </w:t>
       </w:r>
       <w:r>
-        <w:t>button</w:t>
-      </w:r>
-      <w:r>
-        <w:t xml:space="preserve"> </w:t>
+        <w:t xml:space="preserve">button </w:t>
       </w:r>
       <w:r>
         <w:t>makes this happen.</w:t>
@@ -2814,6 +2929,7 @@
           <w:sz w:val="26"/>
           <w:szCs w:val="26"/>
         </w:rPr>
+        <w:lastRenderedPageBreak/>
         <w:t>NOTE: ALL OF OUR DIAGRAMS HAVE BEEN SUBMITTED AS SEPARATE PNGS. ALL ARE LOCATED IN THE SAME DIRECTORY AS THIS.</w:t>
       </w:r>
     </w:p>
@@ -2829,24 +2945,116 @@
     </w:p>
     <w:p>
       <w:r>
+        <w:t>Class Diagram:</w:t>
+      </w:r>
+    </w:p>
+    <w:p/>
+    <w:p>
+      <w:r>
+        <w:t>Sequence Diagrams:</w:t>
+      </w:r>
+    </w:p>
+    <w:p>
+      <w:r>
+        <w:t>For our 3 scenarios the following is how they are designed:</w:t>
+      </w:r>
+    </w:p>
+    <w:p>
+      <w:r>
+        <w:rPr>
+          <w:i/>
+          <w:iCs/>
+        </w:rPr>
+        <w:t>Main Success Scenario</w:t>
+      </w:r>
+      <w:r>
+        <w:t xml:space="preserve">: </w:t>
+      </w:r>
+      <w:r>
+        <w:t xml:space="preserve">we begin with the user creating their account on the app. They then turn on the device as they prepare for a scan. They then navigate to the measure screen and run the scan through the app, which runs for all 24 points. It then sends the user back the results and the user </w:t>
+      </w:r>
+      <w:r>
+        <w:t>add</w:t>
+      </w:r>
+      <w:r>
+        <w:t xml:space="preserve"> that scan to their history, the user goes to the history screen and views data.</w:t>
+      </w:r>
+    </w:p>
+    <w:p>
+      <w:r>
+        <w:rPr>
+          <w:i/>
+          <w:iCs/>
+        </w:rPr>
+        <w:t>Battery Critically low</w:t>
+      </w:r>
+      <w:r>
+        <w:t xml:space="preserve">: </w:t>
+      </w:r>
+      <w:r>
+        <w:t xml:space="preserve">we begin with the user creating their account on the app. They then turn on the device as they prepare for a scan. They then navigate to the measure screen and run the scan through the app, which runs for all 24 points. As the scan runs the battery will slowly </w:t>
+      </w:r>
+      <w:r>
+        <w:t>deplete</w:t>
+      </w:r>
+      <w:r>
+        <w:t>. After the scan, the user doesn't turn off the device and it runs out of battery prompting our out-of-battery procedure which includes a graceful shutdown. </w:t>
+      </w:r>
+    </w:p>
+    <w:p>
+      <w:r>
+        <w:rPr>
+          <w:i/>
+          <w:iCs/>
+        </w:rPr>
+        <w:t>Connection loss during treatment:</w:t>
+      </w:r>
+      <w:r>
+        <w:t xml:space="preserve"> W</w:t>
+      </w:r>
+      <w:r>
+        <w:t xml:space="preserve">e begin with the user creating their account on the app. They then turn on the device as they prepare for a scan. They then navigate to the measure screen and run the scan through the app, which runs for all 24 points. The scan completes successfully and is added to history, the user then runs a scan again and during the scan, the device loses </w:t>
+      </w:r>
+      <w:r>
+        <w:t>connection,</w:t>
+      </w:r>
+      <w:r>
+        <w:t xml:space="preserve"> and the scan stops and does not save to history.</w:t>
+      </w:r>
+      <w:r>
+        <w:t xml:space="preserve"> </w:t>
+      </w:r>
+      <w:r>
+        <w:t>This would be the same procedure if the battery ran out during a scan. It would display that the battery</w:t>
+      </w:r>
+      <w:r>
+        <w:t xml:space="preserve"> </w:t>
+      </w:r>
+      <w:r>
+        <w:t xml:space="preserve">is </w:t>
+      </w:r>
+      <w:r>
+        <w:t>empty,</w:t>
+      </w:r>
+      <w:r>
+        <w:t xml:space="preserve"> and the scan could not go further and would</w:t>
+      </w:r>
+      <w:r>
+        <w:t xml:space="preserve"> </w:t>
+      </w:r>
+      <w:r>
+        <w:t>not save the current scan to history.</w:t>
+      </w:r>
+    </w:p>
+    <w:p/>
+    <w:p>
+      <w:r>
+        <w:t>State Diagrams:</w:t>
+      </w:r>
+    </w:p>
+    <w:p>
+      <w:r>
         <w:lastRenderedPageBreak/>
-        <w:t>Class Diagram:</w:t>
-      </w:r>
-    </w:p>
-    <w:p/>
-    <w:p>
-      <w:r>
-        <w:t>Sequence Diagrams:</w:t>
-      </w:r>
-    </w:p>
-    <w:p/>
-    <w:p>
-      <w:r>
-        <w:t>State Diagrams:</w:t>
-      </w:r>
-    </w:p>
-    <w:p>
-      <w:r>
         <w:t>We have decided to make 2 state diagrams: One for the device, and one for the app.</w:t>
       </w:r>
     </w:p>
@@ -7790,7 +7998,6 @@
   <w:style w:type="character" w:default="1" w:styleId="DefaultParagraphFont">
     <w:name w:val="Default Paragraph Font"/>
     <w:uiPriority w:val="1"/>
-    <w:semiHidden/>
     <w:unhideWhenUsed/>
   </w:style>
   <w:style w:type="table" w:default="1" w:styleId="TableNormal">
@@ -8445,15 +8652,6 @@
 </file>
 
 <file path=customXml/item1.xml><?xml version="1.0" encoding="utf-8"?>
-<?mso-contentType ?>
-<FormTemplates xmlns="http://schemas.microsoft.com/sharepoint/v3/contenttype/forms">
-  <Display>DocumentLibraryForm</Display>
-  <Edit>DocumentLibraryForm</Edit>
-  <New>DocumentLibraryForm</New>
-</FormTemplates>
-</file>
-
-<file path=customXml/item2.xml><?xml version="1.0" encoding="utf-8"?>
 <ct:contentTypeSchema xmlns:ct="http://schemas.microsoft.com/office/2006/metadata/contentType" xmlns:ma="http://schemas.microsoft.com/office/2006/metadata/properties/metaAttributes" ct:_="" ma:_="" ma:contentTypeName="Document" ma:contentTypeID="0x01010035B4F94AC19A7148B1FCDCFF4F85F60A" ma:contentTypeVersion="8" ma:contentTypeDescription="Create a new document." ma:contentTypeScope="" ma:versionID="4fb0124b68826d64669a41f6e3bba3ee">
   <xsd:schema xmlns:xsd="http://www.w3.org/2001/XMLSchema" xmlns:xs="http://www.w3.org/2001/XMLSchema" xmlns:p="http://schemas.microsoft.com/office/2006/metadata/properties" xmlns:ns3="9fb80103-3dfb-4a8c-985b-8b14305fca54" xmlns:ns4="22822bf1-1e08-4e3d-9fa1-2939b36500da" targetNamespace="http://schemas.microsoft.com/office/2006/metadata/properties" ma:root="true" ma:fieldsID="fa047d33cd9eefcaca7fd7025b8e83ae" ns3:_="" ns4:_="">
     <xsd:import namespace="9fb80103-3dfb-4a8c-985b-8b14305fca54"/>
@@ -8642,6 +8840,15 @@
 </ct:contentTypeSchema>
 </file>
 
+<file path=customXml/item2.xml><?xml version="1.0" encoding="utf-8"?>
+<?mso-contentType ?>
+<FormTemplates xmlns="http://schemas.microsoft.com/sharepoint/v3/contenttype/forms">
+  <Display>DocumentLibraryForm</Display>
+  <Edit>DocumentLibraryForm</Edit>
+  <New>DocumentLibraryForm</New>
+</FormTemplates>
+</file>
+
 <file path=customXml/item3.xml><?xml version="1.0" encoding="utf-8"?>
 <p:properties xmlns:p="http://schemas.microsoft.com/office/2006/metadata/properties" xmlns:xsi="http://www.w3.org/2001/XMLSchema-instance" xmlns:pc="http://schemas.microsoft.com/office/infopath/2007/PartnerControls">
   <documentManagement>
@@ -8651,14 +8858,6 @@
 </file>
 
 <file path=customXml/itemProps1.xml><?xml version="1.0" encoding="utf-8"?>
-<ds:datastoreItem xmlns:ds="http://schemas.openxmlformats.org/officeDocument/2006/customXml" ds:itemID="{DBB1FB9C-7924-4F7A-A94B-734717A43807}">
-  <ds:schemaRefs>
-    <ds:schemaRef ds:uri="http://schemas.microsoft.com/sharepoint/v3/contenttype/forms"/>
-  </ds:schemaRefs>
-</ds:datastoreItem>
-</file>
-
-<file path=customXml/itemProps2.xml><?xml version="1.0" encoding="utf-8"?>
 <ds:datastoreItem xmlns:ds="http://schemas.openxmlformats.org/officeDocument/2006/customXml" ds:itemID="{E7F1D6C9-A8D6-4BC3-A55B-81D690E1DF22}">
   <ds:schemaRefs>
     <ds:schemaRef ds:uri="http://schemas.microsoft.com/office/2006/metadata/contentType"/>
@@ -8677,6 +8876,14 @@
 </ds:datastoreItem>
 </file>
 
+<file path=customXml/itemProps2.xml><?xml version="1.0" encoding="utf-8"?>
+<ds:datastoreItem xmlns:ds="http://schemas.openxmlformats.org/officeDocument/2006/customXml" ds:itemID="{DBB1FB9C-7924-4F7A-A94B-734717A43807}">
+  <ds:schemaRefs>
+    <ds:schemaRef ds:uri="http://schemas.microsoft.com/sharepoint/v3/contenttype/forms"/>
+  </ds:schemaRefs>
+</ds:datastoreItem>
+</file>
+
 <file path=customXml/itemProps3.xml><?xml version="1.0" encoding="utf-8"?>
 <ds:datastoreItem xmlns:ds="http://schemas.openxmlformats.org/officeDocument/2006/customXml" ds:itemID="{68D7943D-1C86-4A5E-A90A-EED69CC58994}">
   <ds:schemaRefs>

</xml_diff>